<commit_message>
Mantem a Documentacao Tecnica do CMDCA na mesma pagina
Marca a lista para nao se separar do titulo, de modo que o bloco
"Documentacao Tecnica" do CMDCA fique inteiro em uma pagina, como no
documento original, em vez de deixar um marcador orfao na pagina 2.

Regera o PDF com a paginacao correta.

Co-Authored-By: Claude Opus 5 <noreply@anthropic.com>
Claude-Session: https://claude.ai/code/session_01AA571RESm8k9dhYtnPJDxt
</commit_message>
<xml_diff>
--- a/minhas-oscs/MODELO-documentos-conselhos-cmas-cmdca.docx
+++ b/minhas-oscs/MODELO-documentos-conselhos-cmas-cmdca.docx
@@ -53,6 +53,8 @@
     <w:p>
       <w:pPr>
         <w:pStyle w:val="ListParagraph"/>
+        <w:keepNext w:val="false"/>
+        <w:keepLines/>
         <w:numPr>
           <w:ilvl w:val="0"/>
           <w:numId w:val="2"/>
@@ -71,6 +73,8 @@
     <w:p>
       <w:pPr>
         <w:pStyle w:val="ListParagraph"/>
+        <w:keepNext w:val="false"/>
+        <w:keepLines/>
         <w:numPr>
           <w:ilvl w:val="0"/>
           <w:numId w:val="2"/>
@@ -89,6 +93,8 @@
     <w:p>
       <w:pPr>
         <w:pStyle w:val="ListParagraph"/>
+        <w:keepNext w:val="false"/>
+        <w:keepLines/>
         <w:numPr>
           <w:ilvl w:val="0"/>
           <w:numId w:val="2"/>
@@ -107,6 +113,8 @@
     <w:p>
       <w:pPr>
         <w:pStyle w:val="ListParagraph"/>
+        <w:keepNext w:val="false"/>
+        <w:keepLines/>
         <w:numPr>
           <w:ilvl w:val="0"/>
           <w:numId w:val="2"/>
@@ -125,6 +133,8 @@
     <w:p>
       <w:pPr>
         <w:pStyle w:val="ListParagraph"/>
+        <w:keepNext w:val="false"/>
+        <w:keepLines/>
         <w:numPr>
           <w:ilvl w:val="0"/>
           <w:numId w:val="2"/>
@@ -143,6 +153,8 @@
     <w:p>
       <w:pPr>
         <w:pStyle w:val="ListParagraph"/>
+        <w:keepNext w:val="false"/>
+        <w:keepLines/>
         <w:numPr>
           <w:ilvl w:val="0"/>
           <w:numId w:val="2"/>
@@ -222,6 +234,8 @@
     <w:p>
       <w:pPr>
         <w:pStyle w:val="ListParagraph"/>
+        <w:keepNext w:val="false"/>
+        <w:keepLines/>
         <w:numPr>
           <w:ilvl w:val="0"/>
           <w:numId w:val="2"/>
@@ -240,6 +254,8 @@
     <w:p>
       <w:pPr>
         <w:pStyle w:val="ListParagraph"/>
+        <w:keepNext w:val="false"/>
+        <w:keepLines/>
         <w:numPr>
           <w:ilvl w:val="0"/>
           <w:numId w:val="2"/>
@@ -258,6 +274,8 @@
     <w:p>
       <w:pPr>
         <w:pStyle w:val="ListParagraph"/>
+        <w:keepNext w:val="false"/>
+        <w:keepLines/>
         <w:numPr>
           <w:ilvl w:val="0"/>
           <w:numId w:val="2"/>
@@ -276,6 +294,8 @@
     <w:p>
       <w:pPr>
         <w:pStyle w:val="ListParagraph"/>
+        <w:keepNext w:val="false"/>
+        <w:keepLines/>
         <w:numPr>
           <w:ilvl w:val="0"/>
           <w:numId w:val="2"/>
@@ -318,6 +338,8 @@
     <w:p>
       <w:pPr>
         <w:pStyle w:val="ListParagraph"/>
+        <w:keepNext w:val="false"/>
+        <w:keepLines/>
         <w:numPr>
           <w:ilvl w:val="0"/>
           <w:numId w:val="2"/>
@@ -336,6 +358,8 @@
     <w:p>
       <w:pPr>
         <w:pStyle w:val="ListParagraph"/>
+        <w:keepNext w:val="false"/>
+        <w:keepLines/>
         <w:numPr>
           <w:ilvl w:val="0"/>
           <w:numId w:val="2"/>
@@ -354,6 +378,8 @@
     <w:p>
       <w:pPr>
         <w:pStyle w:val="ListParagraph"/>
+        <w:keepNext w:val="false"/>
+        <w:keepLines/>
         <w:numPr>
           <w:ilvl w:val="0"/>
           <w:numId w:val="2"/>
@@ -372,6 +398,8 @@
     <w:p>
       <w:pPr>
         <w:pStyle w:val="ListParagraph"/>
+        <w:keepNext w:val="false"/>
+        <w:keepLines/>
         <w:numPr>
           <w:ilvl w:val="0"/>
           <w:numId w:val="2"/>
@@ -451,6 +479,8 @@
     <w:p>
       <w:pPr>
         <w:pStyle w:val="ListParagraph"/>
+        <w:keepNext w:val="false"/>
+        <w:keepLines/>
         <w:numPr>
           <w:ilvl w:val="0"/>
           <w:numId w:val="2"/>
@@ -469,6 +499,8 @@
     <w:p>
       <w:pPr>
         <w:pStyle w:val="ListParagraph"/>
+        <w:keepNext w:val="false"/>
+        <w:keepLines/>
         <w:numPr>
           <w:ilvl w:val="0"/>
           <w:numId w:val="2"/>
@@ -511,6 +543,8 @@
     <w:p>
       <w:pPr>
         <w:pStyle w:val="ListParagraph"/>
+        <w:keepNext/>
+        <w:keepLines/>
         <w:numPr>
           <w:ilvl w:val="0"/>
           <w:numId w:val="2"/>
@@ -529,6 +563,8 @@
     <w:p>
       <w:pPr>
         <w:pStyle w:val="ListParagraph"/>
+        <w:keepNext w:val="false"/>
+        <w:keepLines/>
         <w:numPr>
           <w:ilvl w:val="0"/>
           <w:numId w:val="2"/>

</xml_diff>